<commit_message>
feat(gerar-minuta-impugnacao): dados padrão, campos em branco no .docx e rodapé
- Preenche [Inserir CNPJ|Endereço|Nome|RG|CPF] a partir de
  assets/dados-servfaz.json (fora do git, por ter dado de pessoa física;
  modelo fictício em dados-servfaz.exemplo.json) e [Data do Protocolo]
  com --data.
- Campo em branco deixa de barrar a geração: sai em destaque amarelo no
  .docx e o script lista as pendências para preencher à mão no Word.
- Remissões numéricas como [1] passam para o .docx como estão.
- Markdown comum: títulos # a ####, linhas ---, *itálico*, sub-itens
  recuados na lista de alíneas; a trava recusa só referência interna e
  marcação não tratada (código, imagem, link, HTML).
- Timbre: a linha laranja do rodapé subiu para acima do texto, que ela
  cortava ao meio (fix_footer em criar_timbre.py, com teste).

Co-Authored-By: Claude Sonnet 5.5 <noreply@anthropic.com>
</commit_message>
<xml_diff>
--- a/skills/gerar-minuta-impugnacao/assets/timbre-servfaz.docx
+++ b/skills/gerar-minuta-impugnacao/assets/timbre-servfaz.docx
@@ -351,7 +351,7 @@
                 <wp:posOffset>-76200</wp:posOffset>
               </wp:positionH>
               <wp:positionV relativeFrom="paragraph">
-                <wp:posOffset>66040</wp:posOffset>
+                <wp:posOffset>-114300</wp:posOffset>
               </wp:positionV>
               <wp:extent cx="6659880" cy="15240"/>
               <wp:effectExtent l="0" t="0" r="26670" b="22860"/>
@@ -405,7 +405,7 @@
         </mc:Choice>
         <mc:Fallback>
           <w:pict>
-            <v:line w14:anchorId="447C6D82" id="Conector reto 9" o:spid="_x0000_s1026" style="position:absolute;z-index:251661824;visibility:visible;mso-wrap-style:square;mso-width-percent:0;mso-height-percent:0;mso-wrap-distance-left:9pt;mso-wrap-distance-top:0;mso-wrap-distance-right:9pt;mso-wrap-distance-bottom:0;mso-position-horizontal:absolute;mso-position-horizontal-relative:text;mso-position-vertical:absolute;mso-position-vertical-relative:text;mso-width-percent:0;mso-height-percent:0;mso-width-relative:margin;mso-height-relative:margin" from="-6pt,5.2pt" to="518.4pt,6.4pt" o:gfxdata="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" strokecolor="#bb7123" strokeweight="1.5pt">
+            <v:line w14:anchorId="447C6D82" id="Conector reto 9" o:spid="_x0000_s1026" style="position:absolute;z-index:251661824;visibility:visible;mso-wrap-style:square;mso-width-percent:0;mso-height-percent:0;mso-wrap-distance-left:9pt;mso-wrap-distance-top:0;mso-wrap-distance-right:9pt;mso-wrap-distance-bottom:0;mso-position-horizontal:absolute;mso-position-horizontal-relative:text;mso-position-vertical:absolute;mso-position-vertical-relative:text;mso-width-percent:0;mso-height-percent:0;mso-width-relative:margin;mso-height-relative:margin" from="-6pt,-9pt" to="518.4pt,-7.8pt" o:gfxdata="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" strokecolor="#bb7123" strokeweight="1.5pt">
               <v:stroke joinstyle="miter"/>
             </v:line>
           </w:pict>

</xml_diff>